<commit_message>
Update for DM-H3 Files
</commit_message>
<xml_diff>
--- a/BGIL_DBT/validation/DM-H/DM-H3_OPUS.docx
+++ b/BGIL_DBT/validation/DM-H/DM-H3_OPUS.docx
@@ -630,8 +630,11 @@
             <w:tcW w:w="1000" w:type="dxa"/>
             <w:tcMar/>
           </w:tcPr>
-          <w:p wp14:textId="77777777">
-            <w:r/>
+          <w:p wp14:textId="78D6C513">
+            <w:r>
+              <w:rPr/>
+              <w:t>Fail</w:t>
+            </w:r>
           </w:p>
         </w:tc>
         <w:tc>
@@ -713,8 +716,11 @@
             <w:tcW w:w="1000" w:type="dxa"/>
             <w:tcMar/>
           </w:tcPr>
-          <w:p wp14:textId="77777777">
-            <w:r/>
+          <w:p wp14:textId="117585AC">
+            <w:r>
+              <w:rPr/>
+              <w:t>Pass</w:t>
+            </w:r>
           </w:p>
         </w:tc>
         <w:tc>
@@ -783,8 +789,11 @@
             <w:tcW w:w="1000" w:type="dxa"/>
             <w:tcMar/>
           </w:tcPr>
-          <w:p wp14:textId="77777777">
-            <w:r/>
+          <w:p wp14:textId="7CDF5EBE">
+            <w:r>
+              <w:rPr/>
+              <w:t>Pass</w:t>
+            </w:r>
           </w:p>
         </w:tc>
         <w:tc>
@@ -853,8 +862,11 @@
             <w:tcW w:w="1000" w:type="dxa"/>
             <w:tcMar/>
           </w:tcPr>
-          <w:p wp14:textId="77777777">
-            <w:r/>
+          <w:p wp14:textId="2CCF4B41">
+            <w:r>
+              <w:rPr/>
+              <w:t>Pass</w:t>
+            </w:r>
           </w:p>
         </w:tc>
         <w:tc>
@@ -923,8 +935,11 @@
             <w:tcW w:w="1000" w:type="dxa"/>
             <w:tcMar/>
           </w:tcPr>
-          <w:p wp14:textId="77777777">
-            <w:r/>
+          <w:p wp14:textId="7997A2AD">
+            <w:r>
+              <w:rPr/>
+              <w:t>Pass</w:t>
+            </w:r>
           </w:p>
         </w:tc>
         <w:tc>
@@ -3164,10 +3179,18 @@
             <w:tcW w:w="5640" w:type="dxa"/>
             <w:tcMar/>
           </w:tcPr>
-          <w:p wp14:textId="09DB239B">
+          <w:p wp14:textId="7D242BD5">
+            <w:pPr>
+              <w:pStyle w:val="Normal"/>
+              <w:suppressLineNumbers w:val="0"/>
+              <w:bidi w:val="0"/>
+              <w:spacing w:before="0" w:beforeAutospacing="off" w:after="0" w:afterAutospacing="off" w:line="240" w:lineRule="auto"/>
+              <w:ind w:left="0" w:right="0"/>
+              <w:jc w:val="left"/>
+            </w:pPr>
             <w:r>
               <w:rPr/>
-              <w:t>Fail</w:t>
+              <w:t>Pass</w:t>
             </w:r>
           </w:p>
         </w:tc>
@@ -3194,8 +3217,11 @@
             <w:tcW w:w="5640" w:type="dxa"/>
             <w:tcMar/>
           </w:tcPr>
-          <w:p wp14:textId="77777777">
-            <w:r/>
+          <w:p wp14:textId="1D4AFE36">
+            <w:r>
+              <w:rPr/>
+              <w:t>0</w:t>
+            </w:r>
           </w:p>
         </w:tc>
       </w:tr>
@@ -3221,37 +3247,18 @@
             <w:tcW w:w="5640" w:type="dxa"/>
             <w:tcMar/>
           </w:tcPr>
-          <w:p wp14:textId="0FF82940">
+          <w:p wp14:textId="72527080">
             <w:pPr>
               <w:pStyle w:val="Normal"/>
+              <w:suppressLineNumbers w:val="0"/>
+              <w:bidi w:val="0"/>
+              <w:spacing w:before="0" w:beforeAutospacing="off" w:after="0" w:afterAutospacing="off" w:line="240" w:lineRule="auto"/>
+              <w:ind w:left="0" w:right="0"/>
+              <w:jc w:val="left"/>
             </w:pPr>
             <w:r>
               <w:rPr/>
-              <w:t xml:space="preserve">Due to </w:t>
-            </w:r>
-            <w:r>
-              <w:rPr/>
-              <w:t>Record_source</w:t>
-            </w:r>
-            <w:r>
-              <w:rPr/>
-              <w:t xml:space="preserve"> issue (</w:t>
-            </w:r>
-            <w:r>
-              <w:rPr/>
-              <w:t>Record_source</w:t>
-            </w:r>
-            <w:r>
-              <w:rPr/>
-              <w:t xml:space="preserve"> </w:t>
-            </w:r>
-            <w:r>
-              <w:rPr/>
-              <w:t>= 'OPUS'</w:t>
-            </w:r>
-            <w:r>
-              <w:rPr/>
-              <w:t>)</w:t>
+              <w:t>NA</w:t>
             </w:r>
           </w:p>
         </w:tc>

</xml_diff>